<commit_message>
Untrack the cover letter; save revision state and session record
The cover letter carries 17 reviewer mentions and paraphrases comment
substance more fully than the summary of changes already withheld, so leaving
it public was inconsistent with that containment. Untracked at HEAD, kept on
disk, added to .gitignore. No history rewrite; the v0.2.2-paper tag and both
DOIs are untouched.

Also saves the current revision state: the E35a/E35b declarations fix in the
applier, the regenerated manuscript, and the patch-application trace.

Co-Authored-By: Claude Opus 5 <noreply@anthropic.com>
</commit_message>
<xml_diff>
--- a/var_manuscript_cise_r1.docx
+++ b/var_manuscript_cise_r1.docx
@@ -2985,7 +2985,7 @@
     </w:p>
     <w:p>
       <w:pPr>
-        <w:pStyle w:val="FirstParagraph"/>
+        <w:pStyle w:val="ChangedPara"/>
       </w:pPr>
       <w:r>
         <w:rPr>
@@ -2998,12 +2998,12 @@
         <w:t xml:space="preserve"> </w:t>
       </w:r>
       <w:r>
-        <w:t xml:space="preserve">Conceptualization, B.K.; Methodology, B.K. and H.R.; Software, B.K.; Investigation, H.R.; Data curation, H.R.; Formal analysis, H.R.; Writing – original draft, B.K.; Writing – review &amp; editing, B.K. and H.R.</w:t>
-      </w:r>
-    </w:p>
-    <w:p>
-      <w:pPr>
-        <w:pStyle w:val="BodyText"/>
+        <w:t xml:space="preserve">Conceptualization, B.K.; Methodology, B.K. and H.R.; Software, B.K.; Investigation, H.R.; Data curation, H.R.; Formal analysis, H.R.; Writing, original draft, B.K.; Writing, review and editing, B.K. and H.R.</w:t>
+      </w:r>
+    </w:p>
+    <w:p>
+      <w:pPr>
+        <w:pStyle w:val="ChangedPara"/>
       </w:pPr>
       <w:r>
         <w:rPr>

</xml_diff>